<commit_message>
docs: refresh five technical proposal documents
Agent-Logs-Url: https://github.com/AgentForSE/.github/sessions/db6f93d2-080a-4c06-b206-4d15d32b67b4

Co-authored-by: forfire912 <26849387+forfire912@users.noreply.github.com>
</commit_message>
<xml_diff>
--- a/SafetyMatrix技术方案（公开）.docx
+++ b/SafetyMatrix技术方案（公开）.docx
@@ -7,72 +7,37 @@
         <w:jc w:val="center"/>
       </w:pPr>
       <w:r>
-        <w:rPr>
-          <w:rFonts w:ascii="宋体" w:hAnsi="宋体" w:eastAsia="宋体"/>
-          <w:b/>
-          <w:sz w:val="32"/>
-        </w:rPr>
         <w:t>SafetyMatrix 技术方案概要（公开）</w:t>
       </w:r>
     </w:p>
     <w:p>
       <w:r>
-        <w:rPr>
-          <w:rFonts w:ascii="宋体" w:hAnsi="宋体" w:eastAsia="宋体"/>
-          <w:b w:val="0"/>
-          <w:sz w:val="22"/>
-        </w:rPr>
-        <w:t>定位：面向软件需求与设计阶段的安全分析场景，帮助团队围绕风险链路开展更细致的软件层分析，覆盖四项核心功能：</w:t>
+        <w:t>定位：面向软件需求与设计阶段的安全分析场景，帮助团队围绕风险链路开展更细致的软件层分析，覆盖四项核心环节：</w:t>
       </w:r>
     </w:p>
     <w:p>
       <w:r>
-        <w:rPr>
-          <w:rFonts w:ascii="宋体" w:hAnsi="宋体" w:eastAsia="宋体"/>
-          <w:b w:val="0"/>
-          <w:sz w:val="22"/>
-        </w:rPr>
         <w:t>• 需求阶段故障树分析</w:t>
       </w:r>
     </w:p>
     <w:p>
       <w:r>
-        <w:rPr>
-          <w:rFonts w:ascii="宋体" w:hAnsi="宋体" w:eastAsia="宋体"/>
-          <w:b w:val="0"/>
-          <w:sz w:val="22"/>
-        </w:rPr>
-        <w:t>• 设计阶段故障树分析</w:t>
+        <w:t>• 设计阶段故障树细化</w:t>
       </w:r>
     </w:p>
     <w:p>
       <w:r>
-        <w:rPr>
-          <w:rFonts w:ascii="宋体" w:hAnsi="宋体" w:eastAsia="宋体"/>
-          <w:b w:val="0"/>
-          <w:sz w:val="22"/>
-        </w:rPr>
-        <w:t>• 软件失效模式与影响分析</w:t>
+        <w:t>• 失效模式与影响分析</w:t>
       </w:r>
     </w:p>
     <w:p>
       <w:r>
-        <w:rPr>
-          <w:rFonts w:ascii="宋体" w:hAnsi="宋体" w:eastAsia="宋体"/>
-          <w:b w:val="0"/>
-          <w:sz w:val="22"/>
-        </w:rPr>
-        <w:t>• 风险评估与分析报告输出</w:t>
+        <w:t>• 风险评估与成果交付</w:t>
       </w:r>
     </w:p>
     <w:p>
       <w:r>
-        <w:rPr>
-          <w:rFonts w:ascii="宋体" w:hAnsi="宋体" w:eastAsia="宋体"/>
-          <w:b/>
-          <w:sz w:val="26"/>
-        </w:rPr>
-        <w:t>整体技术栈</w:t>
+        <w:t>行业现状与发展趋势</w:t>
       </w:r>
     </w:p>
     <w:tbl>
@@ -93,17 +58,8 @@
             <w:vAlign w:val="center"/>
           </w:tcPr>
           <w:p>
-            <w:pPr>
-              <w:jc w:val="left"/>
-            </w:pPr>
-            <w:r/>
             <w:r>
-              <w:rPr>
-                <w:rFonts w:ascii="宋体" w:hAnsi="宋体" w:eastAsia="宋体"/>
-                <w:b/>
-                <w:sz w:val="21"/>
-              </w:rPr>
-              <w:t>功能点</w:t>
+              <w:t>业务环节</w:t>
             </w:r>
           </w:p>
         </w:tc>
@@ -113,17 +69,8 @@
             <w:vAlign w:val="center"/>
           </w:tcPr>
           <w:p>
-            <w:pPr>
-              <w:jc w:val="left"/>
-            </w:pPr>
-            <w:r/>
             <w:r>
-              <w:rPr>
-                <w:rFonts w:ascii="宋体" w:hAnsi="宋体" w:eastAsia="宋体"/>
-                <w:b/>
-                <w:sz w:val="21"/>
-              </w:rPr>
-              <w:t>技术选型</w:t>
+              <w:t>当前支撑重点</w:t>
             </w:r>
           </w:p>
         </w:tc>
@@ -135,17 +82,8 @@
             <w:vAlign w:val="center"/>
           </w:tcPr>
           <w:p>
-            <w:pPr>
-              <w:jc w:val="left"/>
-            </w:pPr>
-            <w:r/>
             <w:r>
-              <w:rPr>
-                <w:rFonts w:ascii="宋体" w:hAnsi="宋体" w:eastAsia="宋体"/>
-                <w:b w:val="0"/>
-                <w:sz w:val="21"/>
-              </w:rPr>
-              <w:t>软件前端</w:t>
+              <w:t>平台形态</w:t>
             </w:r>
           </w:p>
         </w:tc>
@@ -155,17 +93,8 @@
             <w:vAlign w:val="center"/>
           </w:tcPr>
           <w:p>
-            <w:pPr>
-              <w:jc w:val="left"/>
-            </w:pPr>
-            <w:r/>
             <w:r>
-              <w:rPr>
-                <w:rFonts w:ascii="宋体" w:hAnsi="宋体" w:eastAsia="宋体"/>
-                <w:b w:val="0"/>
-                <w:sz w:val="21"/>
-              </w:rPr>
-              <w:t>React + Vite，突出分析过程、树形结构和结果对比展示</w:t>
+              <w:t>围绕软件安全分析提供项目化作业、过程展示和结果复核能力。</w:t>
             </w:r>
           </w:p>
         </w:tc>
@@ -177,17 +106,8 @@
             <w:vAlign w:val="center"/>
           </w:tcPr>
           <w:p>
-            <w:pPr>
-              <w:jc w:val="left"/>
-            </w:pPr>
-            <w:r/>
             <w:r>
-              <w:rPr>
-                <w:rFonts w:ascii="宋体" w:hAnsi="宋体" w:eastAsia="宋体"/>
-                <w:b w:val="0"/>
-                <w:sz w:val="21"/>
-              </w:rPr>
-              <w:t>软件后端</w:t>
+              <w:t>分析主线</w:t>
             </w:r>
           </w:p>
         </w:tc>
@@ -197,17 +117,8 @@
             <w:vAlign w:val="center"/>
           </w:tcPr>
           <w:p>
-            <w:pPr>
-              <w:jc w:val="left"/>
-            </w:pPr>
-            <w:r/>
             <w:r>
-              <w:rPr>
-                <w:rFonts w:ascii="宋体" w:hAnsi="宋体" w:eastAsia="宋体"/>
-                <w:b w:val="0"/>
-                <w:sz w:val="21"/>
-              </w:rPr>
-              <w:t>Node.js + Express，负责接口服务、项目数据管理和结果落库</w:t>
+              <w:t>覆盖需求识别、设计细化、失效分析和风险排序四个环节。</w:t>
             </w:r>
           </w:p>
         </w:tc>
@@ -219,17 +130,8 @@
             <w:vAlign w:val="center"/>
           </w:tcPr>
           <w:p>
-            <w:pPr>
-              <w:jc w:val="left"/>
-            </w:pPr>
-            <w:r/>
             <w:r>
-              <w:rPr>
-                <w:rFonts w:ascii="宋体" w:hAnsi="宋体" w:eastAsia="宋体"/>
-                <w:b w:val="0"/>
-                <w:sz w:val="21"/>
-              </w:rPr>
-              <w:t>分析引擎</w:t>
+              <w:t>可视呈现</w:t>
             </w:r>
           </w:p>
         </w:tc>
@@ -239,17 +141,8 @@
             <w:vAlign w:val="center"/>
           </w:tcPr>
           <w:p>
-            <w:pPr>
-              <w:jc w:val="left"/>
-            </w:pPr>
-            <w:r/>
             <w:r>
-              <w:rPr>
-                <w:rFonts w:ascii="宋体" w:hAnsi="宋体" w:eastAsia="宋体"/>
-                <w:b w:val="0"/>
-                <w:sz w:val="21"/>
-              </w:rPr>
-              <w:t>以前后端协同的多智能体流程完成故障树和失效模式分析</w:t>
+              <w:t>突出风险链路、重点节点和结果对比，便于评审沟通。</w:t>
             </w:r>
           </w:p>
         </w:tc>
@@ -261,17 +154,8 @@
             <w:vAlign w:val="center"/>
           </w:tcPr>
           <w:p>
-            <w:pPr>
-              <w:jc w:val="left"/>
-            </w:pPr>
-            <w:r/>
             <w:r>
-              <w:rPr>
-                <w:rFonts w:ascii="宋体" w:hAnsi="宋体" w:eastAsia="宋体"/>
-                <w:b w:val="0"/>
-                <w:sz w:val="21"/>
-              </w:rPr>
-              <w:t>大模型接入</w:t>
+              <w:t>知识沉淀</w:t>
             </w:r>
           </w:p>
         </w:tc>
@@ -281,17 +165,8 @@
             <w:vAlign w:val="center"/>
           </w:tcPr>
           <w:p>
-            <w:pPr>
-              <w:jc w:val="left"/>
-            </w:pPr>
-            <w:r/>
             <w:r>
-              <w:rPr>
-                <w:rFonts w:ascii="宋体" w:hAnsi="宋体" w:eastAsia="宋体"/>
-                <w:b w:val="0"/>
-                <w:sz w:val="21"/>
-              </w:rPr>
-              <w:t>支持 Claude 与兼容 OpenAI 的模型接口，按项目配置调用</w:t>
+              <w:t>沉淀典型失效模式、评分规则和历史案例，支持复用。</w:t>
             </w:r>
           </w:p>
         </w:tc>
@@ -303,17 +178,8 @@
             <w:vAlign w:val="center"/>
           </w:tcPr>
           <w:p>
-            <w:pPr>
-              <w:jc w:val="left"/>
-            </w:pPr>
-            <w:r/>
             <w:r>
-              <w:rPr>
-                <w:rFonts w:ascii="宋体" w:hAnsi="宋体" w:eastAsia="宋体"/>
-                <w:b w:val="0"/>
-                <w:sz w:val="21"/>
-              </w:rPr>
-              <w:t>知识与文档处理</w:t>
+              <w:t>过程管控</w:t>
             </w:r>
           </w:p>
         </w:tc>
@@ -323,17 +189,8 @@
             <w:vAlign w:val="center"/>
           </w:tcPr>
           <w:p>
-            <w:pPr>
-              <w:jc w:val="left"/>
-            </w:pPr>
-            <w:r/>
             <w:r>
-              <w:rPr>
-                <w:rFonts w:ascii="宋体" w:hAnsi="宋体" w:eastAsia="宋体"/>
-                <w:b w:val="0"/>
-                <w:sz w:val="21"/>
-              </w:rPr>
-              <w:t>文档解析、经验库检索与报告导出工具组合使用，支撑分析闭环</w:t>
+              <w:t>保留版本差异、评审意见和整改状态，形成闭环。</w:t>
             </w:r>
           </w:p>
         </w:tc>
@@ -345,17 +202,8 @@
             <w:vAlign w:val="center"/>
           </w:tcPr>
           <w:p>
-            <w:pPr>
-              <w:jc w:val="left"/>
-            </w:pPr>
-            <w:r/>
             <w:r>
-              <w:rPr>
-                <w:rFonts w:ascii="宋体" w:hAnsi="宋体" w:eastAsia="宋体"/>
-                <w:b w:val="0"/>
-                <w:sz w:val="21"/>
-              </w:rPr>
-              <w:t>数据存储</w:t>
+              <w:t>部署方式</w:t>
             </w:r>
           </w:p>
         </w:tc>
@@ -365,17 +213,8 @@
             <w:vAlign w:val="center"/>
           </w:tcPr>
           <w:p>
-            <w:pPr>
-              <w:jc w:val="left"/>
-            </w:pPr>
-            <w:r/>
             <w:r>
-              <w:rPr>
-                <w:rFonts w:ascii="宋体" w:hAnsi="宋体" w:eastAsia="宋体"/>
-                <w:b w:val="0"/>
-                <w:sz w:val="21"/>
-              </w:rPr>
-              <w:t>PostgreSQL，保存项目、分析结果和版本对比信息</w:t>
+              <w:t>支持本地化部署和受控环境运行，适配高安全业务。</w:t>
             </w:r>
           </w:p>
         </w:tc>
@@ -387,17 +226,8 @@
             <w:vAlign w:val="center"/>
           </w:tcPr>
           <w:p>
-            <w:pPr>
-              <w:jc w:val="left"/>
-            </w:pPr>
-            <w:r/>
             <w:r>
-              <w:rPr>
-                <w:rFonts w:ascii="宋体" w:hAnsi="宋体" w:eastAsia="宋体"/>
-                <w:b w:val="0"/>
-                <w:sz w:val="21"/>
-              </w:rPr>
-              <w:t>部署方式</w:t>
+              <w:t>演进重点</w:t>
             </w:r>
           </w:p>
         </w:tc>
@@ -407,17 +237,8 @@
             <w:vAlign w:val="center"/>
           </w:tcPr>
           <w:p>
-            <w:pPr>
-              <w:jc w:val="left"/>
-            </w:pPr>
-            <w:r/>
             <w:r>
-              <w:rPr>
-                <w:rFonts w:ascii="宋体" w:hAnsi="宋体" w:eastAsia="宋体"/>
-                <w:b w:val="0"/>
-                <w:sz w:val="21"/>
-              </w:rPr>
-              <w:t>支持 Docker Compose 方式部署，便于演示和项目交付</w:t>
+              <w:t>增强增量分析、风险复盘和跨项目对照能力。</w:t>
             </w:r>
           </w:p>
         </w:tc>
@@ -425,460 +246,187 @@
     </w:tbl>
     <w:p>
       <w:r>
-        <w:rPr>
-          <w:rFonts w:ascii="宋体" w:hAnsi="宋体" w:eastAsia="宋体"/>
-          <w:b/>
-          <w:sz w:val="26"/>
-        </w:rPr>
-        <w:t>四大功能的核心难点与解决方案</w:t>
+        <w:t>四项核心环节的重点与演进方向</w:t>
       </w:r>
     </w:p>
     <w:p>
       <w:r>
-        <w:rPr>
-          <w:rFonts w:ascii="宋体" w:hAnsi="宋体" w:eastAsia="宋体"/>
-          <w:b/>
-          <w:sz w:val="24"/>
-        </w:rPr>
         <w:t>需求阶段故障树分析</w:t>
       </w:r>
     </w:p>
     <w:p>
       <w:r>
-        <w:rPr>
-          <w:rFonts w:ascii="宋体" w:hAnsi="宋体" w:eastAsia="宋体"/>
-          <w:b/>
-          <w:sz w:val="22"/>
-        </w:rPr>
-        <w:t>方案：</w:t>
-      </w:r>
-      <w:r>
-        <w:rPr>
-          <w:rFonts w:ascii="宋体" w:hAnsi="宋体" w:eastAsia="宋体"/>
-          <w:b w:val="0"/>
-          <w:sz w:val="22"/>
-        </w:rPr>
-        <w:t>从需求资料中提炼关键功能和高风险事件，先形成第一版故障树，让团队在设计展开前就能看到主要风险链路。</w:t>
+        <w:t>当前做法：围绕软件需求先识别高风险事件和主要风险链路，在设计展开前形成第一版分析骨架，帮助团队尽早看见重点风险。</w:t>
       </w:r>
     </w:p>
     <w:p>
       <w:r>
-        <w:rPr>
-          <w:rFonts w:ascii="宋体" w:hAnsi="宋体" w:eastAsia="宋体"/>
-          <w:b/>
-          <w:sz w:val="22"/>
-        </w:rPr>
-        <w:t>难点：</w:t>
-      </w:r>
-      <w:r>
-        <w:rPr>
-          <w:rFonts w:ascii="宋体" w:hAnsi="宋体" w:eastAsia="宋体"/>
-          <w:b w:val="0"/>
-          <w:sz w:val="22"/>
-        </w:rPr>
+        <w:t>业务现状：</w:t>
       </w:r>
     </w:p>
     <w:p>
       <w:r>
-        <w:rPr>
-          <w:rFonts w:ascii="宋体" w:hAnsi="宋体" w:eastAsia="宋体"/>
-          <w:b w:val="0"/>
-          <w:sz w:val="22"/>
-        </w:rPr>
-        <w:t>• 需求条目常常偏业务化，需要补足到可分析的风险表达。</w:t>
+        <w:t>• 软件功能越来越复杂，需求阶段就需要尽早识别关键风险。</w:t>
       </w:r>
     </w:p>
     <w:p>
       <w:r>
-        <w:rPr>
-          <w:rFonts w:ascii="宋体" w:hAnsi="宋体" w:eastAsia="宋体"/>
-          <w:b w:val="0"/>
-          <w:sz w:val="22"/>
-        </w:rPr>
-        <w:t>• 不同文档之间可能存在重复、冲突或表述不完整。</w:t>
+        <w:t>• 需求文档常偏业务表达，转成可分析的风险语言并不容易。</w:t>
       </w:r>
     </w:p>
     <w:p>
       <w:r>
-        <w:rPr>
-          <w:rFonts w:ascii="宋体" w:hAnsi="宋体" w:eastAsia="宋体"/>
-          <w:b w:val="0"/>
-          <w:sz w:val="22"/>
-        </w:rPr>
-        <w:t>• 故障树起点选得不准，会影响后续整棵树的质量。</w:t>
+        <w:t>• 越早发现高风险项，后续设计和整改成本越低。</w:t>
       </w:r>
     </w:p>
     <w:p>
       <w:r>
-        <w:rPr>
-          <w:rFonts w:ascii="宋体" w:hAnsi="宋体" w:eastAsia="宋体"/>
-          <w:b/>
-          <w:sz w:val="22"/>
-        </w:rPr>
-        <w:t>待攻关：</w:t>
-      </w:r>
-      <w:r>
-        <w:rPr>
-          <w:rFonts w:ascii="宋体" w:hAnsi="宋体" w:eastAsia="宋体"/>
-          <w:b w:val="0"/>
-          <w:sz w:val="22"/>
-        </w:rPr>
+        <w:t>发展趋势：</w:t>
       </w:r>
     </w:p>
     <w:p>
       <w:r>
-        <w:rPr>
-          <w:rFonts w:ascii="宋体" w:hAnsi="宋体" w:eastAsia="宋体"/>
-          <w:b w:val="0"/>
-          <w:sz w:val="22"/>
-        </w:rPr>
-        <w:t>• 提升需求条目去重和冲突识别能力。</w:t>
+        <w:t>• 风险识别将持续前移，成为需求评审的重要组成部分。</w:t>
       </w:r>
     </w:p>
     <w:p>
       <w:r>
-        <w:rPr>
-          <w:rFonts w:ascii="宋体" w:hAnsi="宋体" w:eastAsia="宋体"/>
-          <w:b w:val="0"/>
-          <w:sz w:val="22"/>
-        </w:rPr>
-        <w:t>• 沉淀更多行业场景的顶事件模板。</w:t>
+        <w:t>• 顶层风险模板和行业经验复用会越来越重要。</w:t>
       </w:r>
     </w:p>
     <w:p>
       <w:r>
-        <w:rPr>
-          <w:rFonts w:ascii="宋体" w:hAnsi="宋体" w:eastAsia="宋体"/>
-          <w:b/>
-          <w:sz w:val="24"/>
-        </w:rPr>
-        <w:t>设计阶段故障树分析</w:t>
+        <w:t>设计阶段故障树细化</w:t>
       </w:r>
     </w:p>
     <w:p>
       <w:r>
-        <w:rPr>
-          <w:rFonts w:ascii="宋体" w:hAnsi="宋体" w:eastAsia="宋体"/>
-          <w:b/>
-          <w:sz w:val="22"/>
-        </w:rPr>
-        <w:t>方案：</w:t>
-      </w:r>
-      <w:r>
-        <w:rPr>
-          <w:rFonts w:ascii="宋体" w:hAnsi="宋体" w:eastAsia="宋体"/>
-          <w:b w:val="0"/>
-          <w:sz w:val="22"/>
-        </w:rPr>
-        <w:t>在设计资料逐步明确后，对故障树进行细化和补全，把模块间关系、接口影响和控制逻辑进一步落到具体设计层面。</w:t>
+        <w:t>当前做法：在设计资料逐步明确后，对风险链路继续细化，把模块关系、接口影响和控制逻辑进一步落实到设计层面。</w:t>
       </w:r>
     </w:p>
     <w:p>
       <w:r>
-        <w:rPr>
-          <w:rFonts w:ascii="宋体" w:hAnsi="宋体" w:eastAsia="宋体"/>
-          <w:b/>
-          <w:sz w:val="22"/>
-        </w:rPr>
-        <w:t>难点：</w:t>
-      </w:r>
-      <w:r>
-        <w:rPr>
-          <w:rFonts w:ascii="宋体" w:hAnsi="宋体" w:eastAsia="宋体"/>
-          <w:b w:val="0"/>
-          <w:sz w:val="22"/>
-        </w:rPr>
+        <w:t>业务现状：</w:t>
       </w:r>
     </w:p>
     <w:p>
       <w:r>
-        <w:rPr>
-          <w:rFonts w:ascii="宋体" w:hAnsi="宋体" w:eastAsia="宋体"/>
-          <w:b w:val="0"/>
-          <w:sz w:val="22"/>
-        </w:rPr>
-        <w:t>• 设计资料颗粒度不一，细化深度难统一。</w:t>
+        <w:t>• 设计资料颗粒度不一，分析深度难统一。</w:t>
       </w:r>
     </w:p>
     <w:p>
       <w:r>
-        <w:rPr>
-          <w:rFonts w:ascii="宋体" w:hAnsi="宋体" w:eastAsia="宋体"/>
-          <w:b w:val="0"/>
-          <w:sz w:val="22"/>
-        </w:rPr>
-        <w:t>• 模块之间关联复杂，容易出现遗漏或重复展开。</w:t>
+        <w:t>• 模块和接口关系复杂，手工展开容易遗漏或重复。</w:t>
       </w:r>
     </w:p>
     <w:p>
       <w:r>
-        <w:rPr>
-          <w:rFonts w:ascii="宋体" w:hAnsi="宋体" w:eastAsia="宋体"/>
-          <w:b w:val="0"/>
-          <w:sz w:val="22"/>
-        </w:rPr>
-        <w:t>• 设计频繁调整时，已有分析结果需要高效跟进。</w:t>
+        <w:t>• 设计频繁调整后，已有分析结果往往难以快速跟进。</w:t>
       </w:r>
     </w:p>
     <w:p>
       <w:r>
-        <w:rPr>
-          <w:rFonts w:ascii="宋体" w:hAnsi="宋体" w:eastAsia="宋体"/>
-          <w:b/>
-          <w:sz w:val="22"/>
-        </w:rPr>
-        <w:t>待攻关：</w:t>
-      </w:r>
-      <w:r>
-        <w:rPr>
-          <w:rFonts w:ascii="宋体" w:hAnsi="宋体" w:eastAsia="宋体"/>
-          <w:b w:val="0"/>
-          <w:sz w:val="22"/>
-        </w:rPr>
+        <w:t>发展趋势：</w:t>
       </w:r>
     </w:p>
     <w:p>
       <w:r>
-        <w:rPr>
-          <w:rFonts w:ascii="宋体" w:hAnsi="宋体" w:eastAsia="宋体"/>
-          <w:b w:val="0"/>
-          <w:sz w:val="22"/>
-        </w:rPr>
-        <w:t>• 增强设计变更后的增量分析能力。</w:t>
+        <w:t>• 增量分析和版本对比会成为日常能力。</w:t>
       </w:r>
     </w:p>
     <w:p>
       <w:r>
-        <w:rPr>
-          <w:rFonts w:ascii="宋体" w:hAnsi="宋体" w:eastAsia="宋体"/>
-          <w:b w:val="0"/>
-          <w:sz w:val="22"/>
-        </w:rPr>
-        <w:t>• 让树结构展示和设计结构展示更加联动。</w:t>
+        <w:t>• 图形展示会更强调与设计结构的联动表达。</w:t>
       </w:r>
     </w:p>
     <w:p>
       <w:r>
-        <w:rPr>
-          <w:rFonts w:ascii="宋体" w:hAnsi="宋体" w:eastAsia="宋体"/>
-          <w:b/>
-          <w:sz w:val="24"/>
-        </w:rPr>
-        <w:t>软件失效模式与影响分析</w:t>
+        <w:t>失效模式与影响分析</w:t>
       </w:r>
     </w:p>
     <w:p>
       <w:r>
-        <w:rPr>
-          <w:rFonts w:ascii="宋体" w:hAnsi="宋体" w:eastAsia="宋体"/>
-          <w:b/>
-          <w:sz w:val="22"/>
-        </w:rPr>
-        <w:t>方案：</w:t>
-      </w:r>
-      <w:r>
-        <w:rPr>
-          <w:rFonts w:ascii="宋体" w:hAnsi="宋体" w:eastAsia="宋体"/>
-          <w:b w:val="0"/>
-          <w:sz w:val="22"/>
-        </w:rPr>
-        <w:t>结合故障树和经验库，从模块、功能和接口多个角度梳理失效模式、影响与改进建议，帮助团队聚焦真正高风险的问题。</w:t>
+        <w:t>当前做法：结合风险链路和历史经验，从模块、功能和接口多个角度梳理失效模式、影响范围和改进建议，帮助团队聚焦真正高风险的问题。</w:t>
       </w:r>
     </w:p>
     <w:p>
       <w:r>
-        <w:rPr>
-          <w:rFonts w:ascii="宋体" w:hAnsi="宋体" w:eastAsia="宋体"/>
-          <w:b/>
-          <w:sz w:val="22"/>
-        </w:rPr>
-        <w:t>难点：</w:t>
-      </w:r>
-      <w:r>
-        <w:rPr>
-          <w:rFonts w:ascii="宋体" w:hAnsi="宋体" w:eastAsia="宋体"/>
-          <w:b w:val="0"/>
-          <w:sz w:val="22"/>
-        </w:rPr>
+        <w:t>业务现状：</w:t>
       </w:r>
     </w:p>
     <w:p>
       <w:r>
-        <w:rPr>
-          <w:rFonts w:ascii="宋体" w:hAnsi="宋体" w:eastAsia="宋体"/>
-          <w:b w:val="0"/>
-          <w:sz w:val="22"/>
-        </w:rPr>
-        <w:t>• 失效模式描述如果不统一，结果难以横向比较。</w:t>
+        <w:t>• 失效模式描述和风险评分口径容易不统一。</w:t>
       </w:r>
     </w:p>
     <w:p>
       <w:r>
-        <w:rPr>
-          <w:rFonts w:ascii="宋体" w:hAnsi="宋体" w:eastAsia="宋体"/>
-          <w:b w:val="0"/>
-          <w:sz w:val="22"/>
-        </w:rPr>
-        <w:t>• 风险等级判断受项目背景影响较大，需要兼顾一致性与灵活性。</w:t>
+        <w:t>• 高风险项筛选仍较依赖资深人员经验判断。</w:t>
       </w:r>
     </w:p>
     <w:p>
       <w:r>
-        <w:rPr>
-          <w:rFonts w:ascii="宋体" w:hAnsi="宋体" w:eastAsia="宋体"/>
-          <w:b w:val="0"/>
-          <w:sz w:val="22"/>
-        </w:rPr>
-        <w:t>• 人工经验很关键，但沉淀和复用往往不足。</w:t>
+        <w:t>• 历史案例复用不足，跨项目对照效率不高。</w:t>
       </w:r>
     </w:p>
     <w:p>
       <w:r>
-        <w:rPr>
-          <w:rFonts w:ascii="宋体" w:hAnsi="宋体" w:eastAsia="宋体"/>
-          <w:b/>
-          <w:sz w:val="22"/>
-        </w:rPr>
-        <w:t>待攻关：</w:t>
-      </w:r>
-      <w:r>
-        <w:rPr>
-          <w:rFonts w:ascii="宋体" w:hAnsi="宋体" w:eastAsia="宋体"/>
-          <w:b w:val="0"/>
-          <w:sz w:val="22"/>
-        </w:rPr>
+        <w:t>发展趋势：</w:t>
       </w:r>
     </w:p>
     <w:p>
       <w:r>
-        <w:rPr>
-          <w:rFonts w:ascii="宋体" w:hAnsi="宋体" w:eastAsia="宋体"/>
-          <w:b w:val="0"/>
-          <w:sz w:val="22"/>
-        </w:rPr>
-        <w:t>• 完善失效模式经验库和评分规则。</w:t>
+        <w:t>• 经验库和规则库会逐步成为评分一致性的基础。</w:t>
       </w:r>
     </w:p>
     <w:p>
       <w:r>
-        <w:rPr>
-          <w:rFonts w:ascii="宋体" w:hAnsi="宋体" w:eastAsia="宋体"/>
-          <w:b w:val="0"/>
-          <w:sz w:val="22"/>
-        </w:rPr>
-        <w:t>• 增强对历史项目结果的复用与对照。</w:t>
+        <w:t>• 风险排序将更多服务于设计整改和评审决策。</w:t>
       </w:r>
     </w:p>
     <w:p>
       <w:r>
-        <w:rPr>
-          <w:rFonts w:ascii="宋体" w:hAnsi="宋体" w:eastAsia="宋体"/>
-          <w:b/>
-          <w:sz w:val="24"/>
-        </w:rPr>
-        <w:t>风险评估与分析报告输出</w:t>
+        <w:t>风险评估与成果交付</w:t>
       </w:r>
     </w:p>
     <w:p>
       <w:r>
-        <w:rPr>
-          <w:rFonts w:ascii="宋体" w:hAnsi="宋体" w:eastAsia="宋体"/>
-          <w:b/>
-          <w:sz w:val="22"/>
-        </w:rPr>
-        <w:t>方案：</w:t>
-      </w:r>
-      <w:r>
-        <w:rPr>
-          <w:rFonts w:ascii="宋体" w:hAnsi="宋体" w:eastAsia="宋体"/>
-          <w:b w:val="0"/>
-          <w:sz w:val="22"/>
-        </w:rPr>
-        <w:t>把故障树、失效模式、风险等级和关键建议集中呈现，形成便于汇报、复盘和交付的分析材料。</w:t>
+        <w:t>当前做法：把故障树、失效模式、风险等级和关键建议集中呈现，形成便于汇报、复盘和交付的分析成果。</w:t>
       </w:r>
     </w:p>
     <w:p>
       <w:r>
-        <w:rPr>
-          <w:rFonts w:ascii="宋体" w:hAnsi="宋体" w:eastAsia="宋体"/>
-          <w:b/>
-          <w:sz w:val="22"/>
-        </w:rPr>
-        <w:t>难点：</w:t>
-      </w:r>
-      <w:r>
-        <w:rPr>
-          <w:rFonts w:ascii="宋体" w:hAnsi="宋体" w:eastAsia="宋体"/>
-          <w:b w:val="0"/>
-          <w:sz w:val="22"/>
-        </w:rPr>
+        <w:t>业务现状：</w:t>
       </w:r>
     </w:p>
     <w:p>
       <w:r>
-        <w:rPr>
-          <w:rFonts w:ascii="宋体" w:hAnsi="宋体" w:eastAsia="宋体"/>
-          <w:b w:val="0"/>
-          <w:sz w:val="22"/>
-        </w:rPr>
-        <w:t>• 图形、矩阵和文字说明需要保持一致。</w:t>
+        <w:t>• 风险图形、分析结论和整改建议常分散在多个材料中。</w:t>
       </w:r>
     </w:p>
     <w:p>
       <w:r>
-        <w:rPr>
-          <w:rFonts w:ascii="宋体" w:hAnsi="宋体" w:eastAsia="宋体"/>
-          <w:b w:val="0"/>
-          <w:sz w:val="22"/>
-        </w:rPr>
-        <w:t>• 版本对比和审查意见往往分散，整合成本高。</w:t>
+        <w:t>• 评审既关注重点风险，也关注处理状态和版本变化。</w:t>
       </w:r>
     </w:p>
     <w:p>
       <w:r>
-        <w:rPr>
-          <w:rFonts w:ascii="宋体" w:hAnsi="宋体" w:eastAsia="宋体"/>
-          <w:b w:val="0"/>
-          <w:sz w:val="22"/>
-        </w:rPr>
-        <w:t>• 不同项目对报告颗粒度和侧重点要求不同。</w:t>
+        <w:t>• 项目管理越来越重视复盘依据和持续更新能力。</w:t>
       </w:r>
     </w:p>
     <w:p>
       <w:r>
-        <w:rPr>
-          <w:rFonts w:ascii="宋体" w:hAnsi="宋体" w:eastAsia="宋体"/>
-          <w:b/>
-          <w:sz w:val="22"/>
-        </w:rPr>
-        <w:t>待攻关：</w:t>
-      </w:r>
-      <w:r>
-        <w:rPr>
-          <w:rFonts w:ascii="宋体" w:hAnsi="宋体" w:eastAsia="宋体"/>
-          <w:b w:val="0"/>
-          <w:sz w:val="22"/>
-        </w:rPr>
+        <w:t>发展趋势：</w:t>
       </w:r>
     </w:p>
     <w:p>
       <w:r>
-        <w:rPr>
-          <w:rFonts w:ascii="宋体" w:hAnsi="宋体" w:eastAsia="宋体"/>
-          <w:b w:val="0"/>
-          <w:sz w:val="22"/>
-        </w:rPr>
-        <w:t>• 提升报告模板的灵活配置能力。</w:t>
+        <w:t>• 统一看板、版本差异和报告联动会更受重视。</w:t>
       </w:r>
     </w:p>
     <w:p>
       <w:r>
-        <w:rPr>
-          <w:rFonts w:ascii="宋体" w:hAnsi="宋体" w:eastAsia="宋体"/>
-          <w:b w:val="0"/>
-          <w:sz w:val="22"/>
-        </w:rPr>
-        <w:t>• 加强版本差异和审查意见的自动整理。</w:t>
+        <w:t>• 交付会从“交一份报告”转向“交一套可持续更新的风险台账”。</w:t>
       </w:r>
     </w:p>
     <w:sectPr>

</xml_diff>